<commit_message>
Fragenkatalog: Abschnitt Auftraggeber-Kommunikation und Fristen ergänzt
</commit_message>
<xml_diff>
--- a/outputs/ki-prozessberatung-kmu/B+H GmbH/fragenkatalog-mitarbeiteranalyse-vorlage.docx
+++ b/outputs/ki-prozessberatung-kmu/B+H GmbH/fragenkatalog-mitarbeiteranalyse-vorlage.docx
@@ -384,6 +384,70 @@
       </w:pPr>
       <w:r>
         <w:t xml:space="preserve">Mit wem im Team sollte als Nächstes gesprochen werden, um die Prozesse im Detail zu verstehen?</w:t>
+      </w:r>
+    </w:p>
+    <w:p>
+      <w:pPr>
+        <w:spacing w:after="60" w:before="160"/>
+      </w:pPr>
+      <w:r>
+        <w:rPr>
+          <w:b/>
+          <w:bCs/>
+        </w:rPr>
+        <w:t xml:space="preserve">Auftraggeber-Kommunikation und Fristen</w:t>
+      </w:r>
+    </w:p>
+    <w:p>
+      <w:pPr>
+        <w:pStyle w:val="ListParagraph"/>
+        <w:numPr>
+          <w:ilvl w:val="0"/>
+          <w:numId w:val="3"/>
+        </w:numPr>
+        <w:spacing w:after="80"/>
+      </w:pPr>
+      <w:r>
+        <w:t xml:space="preserve">Wie oft kommt es vor, dass eine Anforderung eines Auftraggebers (z. B. Bauüberwachung, Planer) in einer E-Mail übersehen oder zu spät bearbeitet wird?</w:t>
+      </w:r>
+    </w:p>
+    <w:p>
+      <w:pPr>
+        <w:pStyle w:val="ListParagraph"/>
+        <w:numPr>
+          <w:ilvl w:val="0"/>
+          <w:numId w:val="3"/>
+        </w:numPr>
+        <w:spacing w:after="80"/>
+      </w:pPr>
+      <w:r>
+        <w:t xml:space="preserve">Gab es schon Konsequenzen durch eine verpasste Auftraggeber-Frist (Mahnung, Vertragsstrafe, verpasster Nachtrag)?</w:t>
+      </w:r>
+    </w:p>
+    <w:p>
+      <w:pPr>
+        <w:pStyle w:val="ListParagraph"/>
+        <w:numPr>
+          <w:ilvl w:val="0"/>
+          <w:numId w:val="3"/>
+        </w:numPr>
+        <w:spacing w:after="80"/>
+      </w:pPr>
+      <w:r>
+        <w:t xml:space="preserve">Wie viele unterschiedliche Postfächer/Personen bekommen relevante Auftraggeber-Anforderungen, und wie wird sichergestellt, dass daraus eine Aufgabe mit Frist wird?</w:t>
+      </w:r>
+    </w:p>
+    <w:p>
+      <w:pPr>
+        <w:pStyle w:val="ListParagraph"/>
+        <w:numPr>
+          <w:ilvl w:val="0"/>
+          <w:numId w:val="3"/>
+        </w:numPr>
+        <w:spacing w:after="80"/>
+      </w:pPr>
+      <w:r>
+        <w:t xml:space="preserve">Gibt es ein System, mit dem Fristen aus E-Mails aktuell nachverfolgt werden, oder läuft das informell?</w:t>
       </w:r>
     </w:p>
     <w:p>

</xml_diff>